<commit_message>
change the scientific web application to e-commercial web application
</commit_message>
<xml_diff>
--- a/ProjectLogs.docx
+++ b/ProjectLogs.docx
@@ -5,25 +5,55 @@
     <w:p>
       <w:pPr>
         <w:rPr>
+          <w:rFonts w:ascii="Arial" w:eastAsia="Arial" w:hAnsi="Arial" w:cs="Arial"/>
           <w:b/>
           <w:bCs/>
-        </w:rPr>
-      </w:pPr>
-      <w:r>
-        <w:rPr>
+          <w:sz w:val="24"/>
+          <w:szCs w:val="24"/>
+        </w:rPr>
+      </w:pPr>
+      <w:r>
+        <w:rPr>
+          <w:rFonts w:ascii="Arial" w:eastAsia="Arial" w:hAnsi="Arial" w:cs="Arial"/>
           <w:b/>
           <w:bCs/>
+          <w:sz w:val="24"/>
+          <w:szCs w:val="24"/>
         </w:rPr>
         <w:t>Instructions</w:t>
       </w:r>
     </w:p>
     <w:p>
-      <w:r>
+      <w:pPr>
+        <w:rPr>
+          <w:rFonts w:ascii="Arial" w:eastAsia="Arial" w:hAnsi="Arial" w:cs="Arial"/>
+          <w:sz w:val="24"/>
+          <w:szCs w:val="24"/>
+        </w:rPr>
+      </w:pPr>
+      <w:r>
+        <w:rPr>
+          <w:rFonts w:ascii="Arial" w:eastAsia="Arial" w:hAnsi="Arial" w:cs="Arial"/>
+          <w:sz w:val="24"/>
+          <w:szCs w:val="24"/>
+        </w:rPr>
         <w:t>Please make your submission for the Problem Statement for your Course project here.</w:t>
       </w:r>
     </w:p>
     <w:p>
-      <w:r>
+      <w:pPr>
+        <w:rPr>
+          <w:rFonts w:ascii="Arial" w:eastAsia="Arial" w:hAnsi="Arial" w:cs="Arial"/>
+          <w:sz w:val="24"/>
+          <w:szCs w:val="24"/>
+        </w:rPr>
+      </w:pPr>
+      <w:r>
+        <w:rPr>
+          <w:rFonts w:ascii="Arial" w:eastAsia="Arial" w:hAnsi="Arial" w:cs="Arial"/>
+          <w:sz w:val="24"/>
+          <w:szCs w:val="24"/>
+        </w:rPr>
         <w:t>README file must contain:</w:t>
       </w:r>
     </w:p>
@@ -33,8 +63,18 @@
           <w:ilvl w:val="0"/>
           <w:numId w:val="1"/>
         </w:numPr>
-      </w:pPr>
-      <w:r>
+        <w:rPr>
+          <w:rFonts w:ascii="Arial" w:eastAsia="Arial" w:hAnsi="Arial" w:cs="Arial"/>
+          <w:sz w:val="24"/>
+          <w:szCs w:val="24"/>
+        </w:rPr>
+      </w:pPr>
+      <w:r>
+        <w:rPr>
+          <w:rFonts w:ascii="Arial" w:eastAsia="Arial" w:hAnsi="Arial" w:cs="Arial"/>
+          <w:sz w:val="24"/>
+          <w:szCs w:val="24"/>
+        </w:rPr>
         <w:t>Problem Statement</w:t>
       </w:r>
     </w:p>
@@ -44,8 +84,18 @@
           <w:ilvl w:val="0"/>
           <w:numId w:val="1"/>
         </w:numPr>
-      </w:pPr>
-      <w:r>
+        <w:rPr>
+          <w:rFonts w:ascii="Arial" w:eastAsia="Arial" w:hAnsi="Arial" w:cs="Arial"/>
+          <w:sz w:val="24"/>
+          <w:szCs w:val="24"/>
+        </w:rPr>
+      </w:pPr>
+      <w:r>
+        <w:rPr>
+          <w:rFonts w:ascii="Arial" w:eastAsia="Arial" w:hAnsi="Arial" w:cs="Arial"/>
+          <w:sz w:val="24"/>
+          <w:szCs w:val="24"/>
+        </w:rPr>
         <w:t>Architecture</w:t>
       </w:r>
     </w:p>
@@ -55,8 +105,18 @@
           <w:ilvl w:val="0"/>
           <w:numId w:val="1"/>
         </w:numPr>
-      </w:pPr>
-      <w:r>
+        <w:rPr>
+          <w:rFonts w:ascii="Arial" w:eastAsia="Arial" w:hAnsi="Arial" w:cs="Arial"/>
+          <w:sz w:val="24"/>
+          <w:szCs w:val="24"/>
+        </w:rPr>
+      </w:pPr>
+      <w:r>
+        <w:rPr>
+          <w:rFonts w:ascii="Arial" w:eastAsia="Arial" w:hAnsi="Arial" w:cs="Arial"/>
+          <w:sz w:val="24"/>
+          <w:szCs w:val="24"/>
+        </w:rPr>
         <w:t>Class Diagram</w:t>
       </w:r>
     </w:p>
@@ -66,145 +126,600 @@
           <w:ilvl w:val="0"/>
           <w:numId w:val="1"/>
         </w:numPr>
-      </w:pPr>
-      <w:r>
+        <w:rPr>
+          <w:rFonts w:ascii="Arial" w:eastAsia="Arial" w:hAnsi="Arial" w:cs="Arial"/>
+          <w:sz w:val="24"/>
+          <w:szCs w:val="24"/>
+        </w:rPr>
+      </w:pPr>
+      <w:r>
+        <w:rPr>
+          <w:rFonts w:ascii="Arial" w:eastAsia="Arial" w:hAnsi="Arial" w:cs="Arial"/>
+          <w:sz w:val="24"/>
+          <w:szCs w:val="24"/>
+        </w:rPr>
         <w:t>ER Diagram</w:t>
       </w:r>
     </w:p>
     <w:p>
-      <w:r>
+      <w:pPr>
+        <w:rPr>
+          <w:rFonts w:ascii="Arial" w:eastAsia="Arial" w:hAnsi="Arial" w:cs="Arial"/>
+          <w:sz w:val="24"/>
+          <w:szCs w:val="24"/>
+        </w:rPr>
+      </w:pPr>
+      <w:r>
+        <w:rPr>
+          <w:rFonts w:ascii="Arial" w:eastAsia="Arial" w:hAnsi="Arial" w:cs="Arial"/>
+          <w:sz w:val="24"/>
+          <w:szCs w:val="24"/>
+        </w:rPr>
         <w:t>You may push the document to Course Project in a repo in your GitHub and submit the URL here.</w:t>
       </w:r>
     </w:p>
-    <w:p/>
-    <w:p>
-      <w:r>
+    <w:p>
+      <w:pPr>
+        <w:rPr>
+          <w:rFonts w:ascii="Arial" w:eastAsia="Arial" w:hAnsi="Arial" w:cs="Arial"/>
+          <w:sz w:val="24"/>
+          <w:szCs w:val="24"/>
+        </w:rPr>
+      </w:pPr>
+    </w:p>
+    <w:p>
+      <w:pPr>
+        <w:rPr>
+          <w:rFonts w:ascii="Arial" w:eastAsia="Arial" w:hAnsi="Arial" w:cs="Arial"/>
+          <w:sz w:val="24"/>
+          <w:szCs w:val="24"/>
+        </w:rPr>
+      </w:pPr>
+      <w:r>
+        <w:rPr>
+          <w:rFonts w:ascii="Arial" w:eastAsia="Arial" w:hAnsi="Arial" w:cs="Arial"/>
+          <w:sz w:val="24"/>
+          <w:szCs w:val="24"/>
+        </w:rPr>
         <w:t>Need to create an application that people can access from any where</w:t>
       </w:r>
       <w:r>
+        <w:rPr>
+          <w:rFonts w:ascii="Arial" w:eastAsia="Arial" w:hAnsi="Arial" w:cs="Arial"/>
+          <w:sz w:val="24"/>
+          <w:szCs w:val="24"/>
+        </w:rPr>
         <w:t>:</w:t>
       </w:r>
     </w:p>
     <w:p>
-      <w:r>
+      <w:pPr>
+        <w:rPr>
+          <w:rFonts w:ascii="Arial" w:eastAsia="Arial" w:hAnsi="Arial" w:cs="Arial"/>
+          <w:sz w:val="24"/>
+          <w:szCs w:val="24"/>
+        </w:rPr>
+      </w:pPr>
+      <w:r>
+        <w:rPr>
+          <w:rFonts w:ascii="Arial" w:eastAsia="Arial" w:hAnsi="Arial" w:cs="Arial"/>
+          <w:sz w:val="24"/>
+          <w:szCs w:val="24"/>
+        </w:rPr>
         <w:t>Topic web application for</w:t>
       </w:r>
       <w:r>
-        <w:t xml:space="preserve"> thermal analys (</w:t>
-      </w:r>
-      <w:r>
-        <w:t>computational fluid dynamics</w:t>
-      </w:r>
-      <w:r>
-        <w:t>)</w:t>
-      </w:r>
-      <w:r>
+        <w:rPr>
+          <w:rFonts w:ascii="Arial" w:eastAsia="Arial" w:hAnsi="Arial" w:cs="Arial"/>
+          <w:sz w:val="24"/>
+          <w:szCs w:val="24"/>
+        </w:rPr>
+        <w:t xml:space="preserve"> thermal analys (computational fluid dynamics)</w:t>
+      </w:r>
+      <w:r>
+        <w:rPr>
+          <w:rFonts w:ascii="Arial" w:eastAsia="Arial" w:hAnsi="Arial" w:cs="Arial"/>
+          <w:sz w:val="24"/>
+          <w:szCs w:val="24"/>
+        </w:rPr>
         <w:t>.</w:t>
       </w:r>
     </w:p>
     <w:p>
       <w:pPr>
-        <w:rPr>
+        <w:pStyle w:val="Heading3"/>
+        <w:shd w:val="clear" w:color="auto" w:fill="FFFFFF" w:themeFill="background1"/>
+        <w:spacing w:before="644" w:after="215"/>
+        <w:rPr>
+          <w:rFonts w:ascii="Arial" w:eastAsia="Arial" w:hAnsi="Arial" w:cs="Arial"/>
           <w:b/>
           <w:bCs/>
-        </w:rPr>
-      </w:pPr>
-      <w:r>
-        <w:rPr>
+          <w:color w:val="162521"/>
+          <w:sz w:val="24"/>
+          <w:szCs w:val="24"/>
+        </w:rPr>
+      </w:pPr>
+      <w:r>
+        <w:rPr>
+          <w:rFonts w:ascii="Arial" w:eastAsia="Arial" w:hAnsi="Arial" w:cs="Arial"/>
           <w:b/>
           <w:bCs/>
-        </w:rPr>
-        <w:t>Problem Statement:</w:t>
-      </w:r>
-    </w:p>
-    <w:p>
-      <w:r>
-        <w:t>Create a web application for thermal analysis</w:t>
-      </w:r>
-      <w:r>
-        <w:t xml:space="preserve"> (CFD)</w:t>
-      </w:r>
-      <w:r>
-        <w:t>, support</w:t>
-      </w:r>
-      <w:r>
-        <w:t>ing</w:t>
-      </w:r>
-      <w:r>
-        <w:t xml:space="preserve"> the convenience for </w:t>
-      </w:r>
-      <w:r>
-        <w:t>CFD engineer</w:t>
-      </w:r>
-      <w:r>
-        <w:t xml:space="preserve">. </w:t>
-      </w:r>
-    </w:p>
-    <w:p>
-      <w:pPr>
-        <w:rPr>
+          <w:color w:val="162521"/>
+          <w:sz w:val="24"/>
+          <w:szCs w:val="24"/>
+        </w:rPr>
+        <w:t>Step 1: Project Conceptualization and Planning</w:t>
+      </w:r>
+    </w:p>
+    <w:p>
+      <w:pPr>
+        <w:rPr>
+          <w:rFonts w:ascii="Arial" w:eastAsia="Arial" w:hAnsi="Arial" w:cs="Arial"/>
+          <w:sz w:val="24"/>
+          <w:szCs w:val="24"/>
+        </w:rPr>
+      </w:pPr>
+    </w:p>
+    <w:p>
+      <w:pPr>
+        <w:rPr>
+          <w:rFonts w:ascii="Arial" w:eastAsia="Arial" w:hAnsi="Arial" w:cs="Arial"/>
           <w:b/>
           <w:bCs/>
-        </w:rPr>
-      </w:pPr>
-      <w:r>
-        <w:t>Can hand</w:t>
-      </w:r>
-      <w:r>
-        <w:t>le</w:t>
-      </w:r>
-      <w:r>
-        <w:t xml:space="preserve"> running </w:t>
-      </w:r>
-      <w:r>
-        <w:t xml:space="preserve">thermal analysis with </w:t>
-      </w:r>
-      <w:r>
-        <w:t>OpenSource</w:t>
-      </w:r>
-      <w:r>
-        <w:t xml:space="preserve"> engine, </w:t>
-      </w:r>
-      <w:r>
-        <w:t>support OpenGL</w:t>
-      </w:r>
-      <w:r>
-        <w:t xml:space="preserve">, </w:t>
-      </w:r>
-      <w:r>
-        <w:t>VTK, ParaView</w:t>
-      </w:r>
-      <w:r>
-        <w:t xml:space="preserve"> for result viewing.</w:t>
-      </w:r>
-    </w:p>
-    <w:p>
-      <w:r>
-        <w:t xml:space="preserve">Can handle </w:t>
-      </w:r>
-      <w:r>
-        <w:t xml:space="preserve">automation </w:t>
-      </w:r>
-      <w:r>
-        <w:t xml:space="preserve">running </w:t>
-      </w:r>
-      <w:r>
-        <w:t>meshing task on cloud automation.</w:t>
-      </w:r>
-    </w:p>
-    <w:p/>
-    <w:p>
-      <w:r>
-        <w:rPr>
+          <w:sz w:val="24"/>
+          <w:szCs w:val="24"/>
+        </w:rPr>
+      </w:pPr>
+      <w:r>
+        <w:rPr>
+          <w:rFonts w:ascii="Arial" w:eastAsia="Arial" w:hAnsi="Arial" w:cs="Arial"/>
           <w:b/>
           <w:bCs/>
+          <w:sz w:val="24"/>
+          <w:szCs w:val="24"/>
+        </w:rPr>
+        <w:t>Problem Statement:</w:t>
+      </w:r>
+    </w:p>
+    <w:p>
+      <w:pPr>
+        <w:rPr>
+          <w:rFonts w:ascii="Arial" w:eastAsia="Arial" w:hAnsi="Arial" w:cs="Arial"/>
+          <w:sz w:val="24"/>
+          <w:szCs w:val="24"/>
+        </w:rPr>
+      </w:pPr>
+      <w:r>
+        <w:rPr>
+          <w:rFonts w:ascii="Arial" w:eastAsia="Arial" w:hAnsi="Arial" w:cs="Arial"/>
+          <w:sz w:val="24"/>
+          <w:szCs w:val="24"/>
+        </w:rPr>
+        <w:t>Create an e-commercial web application</w:t>
+      </w:r>
+      <w:r>
+        <w:rPr>
+          <w:rFonts w:ascii="Arial" w:eastAsia="Arial" w:hAnsi="Arial" w:cs="Arial"/>
+          <w:sz w:val="24"/>
+          <w:szCs w:val="24"/>
+        </w:rPr>
+        <w:t xml:space="preserve"> to automate the business processes and communication through</w:t>
+      </w:r>
+      <w:r>
+        <w:rPr>
+          <w:rFonts w:ascii="Arial" w:eastAsia="Arial" w:hAnsi="Arial" w:cs="Arial"/>
+          <w:sz w:val="24"/>
+          <w:szCs w:val="24"/>
+        </w:rPr>
+        <w:t xml:space="preserve"> online invoicing, reducing billing, client/</w:t>
+      </w:r>
+      <w:r>
+        <w:rPr>
+          <w:rFonts w:ascii="Arial" w:eastAsia="Arial" w:hAnsi="Arial" w:cs="Arial"/>
+          <w:sz w:val="24"/>
+          <w:szCs w:val="24"/>
+        </w:rPr>
+        <w:t>vendor panels, time tracking, workflows and more</w:t>
+      </w:r>
+    </w:p>
+    <w:p>
+      <w:pPr>
+        <w:rPr>
+          <w:rFonts w:ascii="Arial" w:eastAsia="Arial" w:hAnsi="Arial" w:cs="Arial"/>
+          <w:b/>
+          <w:bCs/>
+          <w:sz w:val="24"/>
+          <w:szCs w:val="24"/>
+        </w:rPr>
+      </w:pPr>
+    </w:p>
+    <w:p>
+      <w:pPr>
+        <w:rPr>
+          <w:rFonts w:ascii="Arial" w:eastAsia="Arial" w:hAnsi="Arial" w:cs="Arial"/>
+          <w:strike/>
+          <w:sz w:val="24"/>
+          <w:szCs w:val="24"/>
+        </w:rPr>
+      </w:pPr>
+      <w:r>
+        <w:rPr>
+          <w:rFonts w:ascii="Arial" w:eastAsia="Arial" w:hAnsi="Arial" w:cs="Arial"/>
+          <w:strike/>
+          <w:sz w:val="24"/>
+          <w:szCs w:val="24"/>
+        </w:rPr>
+        <w:t>Create a web application for thermal analysis</w:t>
+      </w:r>
+      <w:r>
+        <w:rPr>
+          <w:rFonts w:ascii="Arial" w:eastAsia="Arial" w:hAnsi="Arial" w:cs="Arial"/>
+          <w:strike/>
+          <w:sz w:val="24"/>
+          <w:szCs w:val="24"/>
+        </w:rPr>
+        <w:t xml:space="preserve"> (CFD)</w:t>
+      </w:r>
+      <w:r>
+        <w:rPr>
+          <w:rFonts w:ascii="Arial" w:eastAsia="Arial" w:hAnsi="Arial" w:cs="Arial"/>
+          <w:strike/>
+          <w:sz w:val="24"/>
+          <w:szCs w:val="24"/>
+        </w:rPr>
+        <w:t>, support</w:t>
+      </w:r>
+      <w:r>
+        <w:rPr>
+          <w:rFonts w:ascii="Arial" w:eastAsia="Arial" w:hAnsi="Arial" w:cs="Arial"/>
+          <w:strike/>
+          <w:sz w:val="24"/>
+          <w:szCs w:val="24"/>
+        </w:rPr>
+        <w:t>ing</w:t>
+      </w:r>
+      <w:r>
+        <w:rPr>
+          <w:rFonts w:ascii="Arial" w:eastAsia="Arial" w:hAnsi="Arial" w:cs="Arial"/>
+          <w:strike/>
+          <w:sz w:val="24"/>
+          <w:szCs w:val="24"/>
+        </w:rPr>
+        <w:t xml:space="preserve"> the convenience for </w:t>
+      </w:r>
+      <w:r>
+        <w:rPr>
+          <w:rFonts w:ascii="Arial" w:eastAsia="Arial" w:hAnsi="Arial" w:cs="Arial"/>
+          <w:strike/>
+          <w:sz w:val="24"/>
+          <w:szCs w:val="24"/>
+        </w:rPr>
+        <w:t>CFD engineer</w:t>
+      </w:r>
+      <w:r>
+        <w:rPr>
+          <w:rFonts w:ascii="Arial" w:eastAsia="Arial" w:hAnsi="Arial" w:cs="Arial"/>
+          <w:strike/>
+          <w:sz w:val="24"/>
+          <w:szCs w:val="24"/>
+        </w:rPr>
+        <w:t xml:space="preserve">. </w:t>
+      </w:r>
+    </w:p>
+    <w:p>
+      <w:pPr>
+        <w:rPr>
+          <w:rFonts w:ascii="Arial" w:eastAsia="Arial" w:hAnsi="Arial" w:cs="Arial"/>
+          <w:b/>
+          <w:bCs/>
+          <w:strike/>
+          <w:sz w:val="24"/>
+          <w:szCs w:val="24"/>
+        </w:rPr>
+      </w:pPr>
+      <w:r>
+        <w:rPr>
+          <w:rFonts w:ascii="Arial" w:eastAsia="Arial" w:hAnsi="Arial" w:cs="Arial"/>
+          <w:strike/>
+          <w:sz w:val="24"/>
+          <w:szCs w:val="24"/>
+        </w:rPr>
+        <w:t>Can hand</w:t>
+      </w:r>
+      <w:r>
+        <w:rPr>
+          <w:rFonts w:ascii="Arial" w:eastAsia="Arial" w:hAnsi="Arial" w:cs="Arial"/>
+          <w:strike/>
+          <w:sz w:val="24"/>
+          <w:szCs w:val="24"/>
+        </w:rPr>
+        <w:t>le</w:t>
+      </w:r>
+      <w:r>
+        <w:rPr>
+          <w:rFonts w:ascii="Arial" w:eastAsia="Arial" w:hAnsi="Arial" w:cs="Arial"/>
+          <w:strike/>
+          <w:sz w:val="24"/>
+          <w:szCs w:val="24"/>
+        </w:rPr>
+        <w:t xml:space="preserve"> running </w:t>
+      </w:r>
+      <w:r>
+        <w:rPr>
+          <w:rFonts w:ascii="Arial" w:eastAsia="Arial" w:hAnsi="Arial" w:cs="Arial"/>
+          <w:strike/>
+          <w:sz w:val="24"/>
+          <w:szCs w:val="24"/>
+        </w:rPr>
+        <w:t xml:space="preserve">thermal analysis with </w:t>
+      </w:r>
+      <w:r>
+        <w:rPr>
+          <w:rFonts w:ascii="Arial" w:eastAsia="Arial" w:hAnsi="Arial" w:cs="Arial"/>
+          <w:strike/>
+          <w:sz w:val="24"/>
+          <w:szCs w:val="24"/>
+        </w:rPr>
+        <w:t>OpenSource</w:t>
+      </w:r>
+      <w:r>
+        <w:rPr>
+          <w:rFonts w:ascii="Arial" w:eastAsia="Arial" w:hAnsi="Arial" w:cs="Arial"/>
+          <w:strike/>
+          <w:sz w:val="24"/>
+          <w:szCs w:val="24"/>
+        </w:rPr>
+        <w:t xml:space="preserve"> engine, </w:t>
+      </w:r>
+      <w:r>
+        <w:rPr>
+          <w:rFonts w:ascii="Arial" w:eastAsia="Arial" w:hAnsi="Arial" w:cs="Arial"/>
+          <w:strike/>
+          <w:sz w:val="24"/>
+          <w:szCs w:val="24"/>
+        </w:rPr>
+        <w:t>support OpenGL</w:t>
+      </w:r>
+      <w:r>
+        <w:rPr>
+          <w:rFonts w:ascii="Arial" w:eastAsia="Arial" w:hAnsi="Arial" w:cs="Arial"/>
+          <w:strike/>
+          <w:sz w:val="24"/>
+          <w:szCs w:val="24"/>
+        </w:rPr>
+        <w:t xml:space="preserve">, </w:t>
+      </w:r>
+      <w:r>
+        <w:rPr>
+          <w:rFonts w:ascii="Arial" w:eastAsia="Arial" w:hAnsi="Arial" w:cs="Arial"/>
+          <w:strike/>
+          <w:sz w:val="24"/>
+          <w:szCs w:val="24"/>
+        </w:rPr>
+        <w:t>VTK, ParaView</w:t>
+      </w:r>
+      <w:r>
+        <w:rPr>
+          <w:rFonts w:ascii="Arial" w:eastAsia="Arial" w:hAnsi="Arial" w:cs="Arial"/>
+          <w:strike/>
+          <w:sz w:val="24"/>
+          <w:szCs w:val="24"/>
+        </w:rPr>
+        <w:t xml:space="preserve"> for result viewing.</w:t>
+      </w:r>
+    </w:p>
+    <w:p>
+      <w:pPr>
+        <w:rPr>
+          <w:rFonts w:ascii="Arial" w:eastAsia="Arial" w:hAnsi="Arial" w:cs="Arial"/>
+          <w:strike/>
+          <w:sz w:val="24"/>
+          <w:szCs w:val="24"/>
+        </w:rPr>
+      </w:pPr>
+      <w:r>
+        <w:rPr>
+          <w:rFonts w:ascii="Arial" w:eastAsia="Arial" w:hAnsi="Arial" w:cs="Arial"/>
+          <w:strike/>
+          <w:sz w:val="24"/>
+          <w:szCs w:val="24"/>
+        </w:rPr>
+        <w:t xml:space="preserve">Can handle </w:t>
+      </w:r>
+      <w:r>
+        <w:rPr>
+          <w:rFonts w:ascii="Arial" w:eastAsia="Arial" w:hAnsi="Arial" w:cs="Arial"/>
+          <w:strike/>
+          <w:sz w:val="24"/>
+          <w:szCs w:val="24"/>
+        </w:rPr>
+        <w:t xml:space="preserve">automation </w:t>
+      </w:r>
+      <w:r>
+        <w:rPr>
+          <w:rFonts w:ascii="Arial" w:eastAsia="Arial" w:hAnsi="Arial" w:cs="Arial"/>
+          <w:strike/>
+          <w:sz w:val="24"/>
+          <w:szCs w:val="24"/>
+        </w:rPr>
+        <w:t xml:space="preserve">running </w:t>
+      </w:r>
+      <w:r>
+        <w:rPr>
+          <w:rFonts w:ascii="Arial" w:eastAsia="Arial" w:hAnsi="Arial" w:cs="Arial"/>
+          <w:strike/>
+          <w:sz w:val="24"/>
+          <w:szCs w:val="24"/>
+        </w:rPr>
+        <w:t>meshing task on cloud automation.</w:t>
+      </w:r>
+    </w:p>
+    <w:p>
+      <w:pPr>
+        <w:rPr>
+          <w:rFonts w:ascii="Arial" w:eastAsia="Arial" w:hAnsi="Arial" w:cs="Arial"/>
+          <w:sz w:val="24"/>
+          <w:szCs w:val="24"/>
+        </w:rPr>
+      </w:pPr>
+    </w:p>
+    <w:p>
+      <w:pPr>
+        <w:rPr>
+          <w:rFonts w:ascii="Arial" w:eastAsia="Arial" w:hAnsi="Arial" w:cs="Arial"/>
+          <w:sz w:val="24"/>
+          <w:szCs w:val="24"/>
+        </w:rPr>
+      </w:pPr>
+    </w:p>
+    <w:p>
+      <w:pPr>
+        <w:rPr>
+          <w:rFonts w:ascii="Arial" w:eastAsia="Arial" w:hAnsi="Arial" w:cs="Arial"/>
+          <w:sz w:val="24"/>
+          <w:szCs w:val="24"/>
+        </w:rPr>
+      </w:pPr>
+      <w:r>
+        <w:rPr>
+          <w:rFonts w:ascii="Arial" w:eastAsia="Arial" w:hAnsi="Arial" w:cs="Arial"/>
+          <w:sz w:val="24"/>
+          <w:szCs w:val="24"/>
+        </w:rPr>
+        <w:t>Example</w:t>
+      </w:r>
+      <w:r>
+        <w:rPr>
+          <w:rFonts w:ascii="Arial" w:eastAsia="Arial" w:hAnsi="Arial" w:cs="Arial"/>
+          <w:sz w:val="24"/>
+          <w:szCs w:val="24"/>
+        </w:rPr>
+        <w:t xml:space="preserve"> story of the project: </w:t>
+      </w:r>
+    </w:p>
+    <w:p>
+      <w:pPr>
+        <w:rPr>
+          <w:rFonts w:ascii="Arial" w:eastAsia="Arial" w:hAnsi="Arial" w:cs="Arial"/>
+          <w:sz w:val="24"/>
+          <w:szCs w:val="24"/>
+        </w:rPr>
+      </w:pPr>
+    </w:p>
+    <w:p>
+      <w:pPr>
+        <w:rPr>
+          <w:rFonts w:ascii="Arial" w:eastAsia="Arial" w:hAnsi="Arial" w:cs="Arial"/>
+          <w:sz w:val="24"/>
+          <w:szCs w:val="24"/>
+        </w:rPr>
+      </w:pPr>
+      <w:r>
+        <w:rPr>
+          <w:rFonts w:ascii="Arial" w:eastAsia="Arial" w:hAnsi="Arial" w:cs="Arial"/>
+          <w:sz w:val="24"/>
+          <w:szCs w:val="24"/>
+        </w:rPr>
+        <w:t>Identify your users/actors:</w:t>
+      </w:r>
+    </w:p>
+    <w:p>
+      <w:pPr>
+        <w:pStyle w:val="ListParagraph"/>
+        <w:numPr>
+          <w:ilvl w:val="0"/>
+          <w:numId w:val="4"/>
+        </w:numPr>
+        <w:rPr>
+          <w:rFonts w:ascii="Arial" w:eastAsia="Arial" w:hAnsi="Arial" w:cs="Arial"/>
+          <w:sz w:val="24"/>
+          <w:szCs w:val="24"/>
+        </w:rPr>
+      </w:pPr>
+      <w:r>
+        <w:rPr>
+          <w:rFonts w:ascii="Arial" w:eastAsia="Arial" w:hAnsi="Arial" w:cs="Arial"/>
+          <w:sz w:val="24"/>
+          <w:szCs w:val="24"/>
+        </w:rPr>
+        <w:t>Actor 1</w:t>
+      </w:r>
+    </w:p>
+    <w:p>
+      <w:pPr>
+        <w:rPr>
+          <w:rFonts w:ascii="Arial" w:eastAsia="Arial" w:hAnsi="Arial" w:cs="Arial"/>
+          <w:sz w:val="24"/>
+          <w:szCs w:val="24"/>
+        </w:rPr>
+      </w:pPr>
+      <w:r>
+        <w:rPr>
+          <w:rFonts w:ascii="Arial" w:eastAsia="Arial" w:hAnsi="Arial" w:cs="Arial"/>
+          <w:sz w:val="24"/>
+          <w:szCs w:val="24"/>
+        </w:rPr>
+        <w:t>Each actor is performing what actions in your application?</w:t>
+      </w:r>
+    </w:p>
+    <w:p>
+      <w:pPr>
+        <w:rPr>
+          <w:rFonts w:ascii="Arial" w:eastAsia="Arial" w:hAnsi="Arial" w:cs="Arial"/>
+          <w:sz w:val="24"/>
+          <w:szCs w:val="24"/>
+        </w:rPr>
+      </w:pPr>
+      <w:r>
+        <w:rPr>
+          <w:rFonts w:ascii="Arial" w:eastAsia="Arial" w:hAnsi="Arial" w:cs="Arial"/>
+          <w:sz w:val="24"/>
+          <w:szCs w:val="24"/>
+        </w:rPr>
+        <w:t xml:space="preserve">User will operate </w:t>
+      </w:r>
+    </w:p>
+    <w:p>
+      <w:pPr>
+        <w:rPr>
+          <w:rFonts w:ascii="Arial" w:eastAsia="Arial" w:hAnsi="Arial" w:cs="Arial"/>
+          <w:sz w:val="24"/>
+          <w:szCs w:val="24"/>
+        </w:rPr>
+      </w:pPr>
+    </w:p>
+    <w:p>
+      <w:pPr>
+        <w:rPr>
+          <w:rFonts w:ascii="Arial" w:eastAsia="Arial" w:hAnsi="Arial" w:cs="Arial"/>
+          <w:sz w:val="24"/>
+          <w:szCs w:val="24"/>
+        </w:rPr>
+      </w:pPr>
+      <w:r>
+        <w:rPr>
+          <w:rFonts w:ascii="Arial" w:eastAsia="Arial" w:hAnsi="Arial" w:cs="Arial"/>
+          <w:b/>
+          <w:bCs/>
+          <w:sz w:val="24"/>
+          <w:szCs w:val="24"/>
         </w:rPr>
         <w:t>Architecture</w:t>
       </w:r>
       <w:r>
+        <w:rPr>
+          <w:rFonts w:ascii="Arial" w:eastAsia="Arial" w:hAnsi="Arial" w:cs="Arial"/>
+          <w:sz w:val="24"/>
+          <w:szCs w:val="24"/>
+        </w:rPr>
         <w:t xml:space="preserve">: </w:t>
       </w:r>
       <w:r>
+        <w:rPr>
+          <w:rFonts w:ascii="Arial" w:eastAsia="Arial" w:hAnsi="Arial" w:cs="Arial"/>
+          <w:sz w:val="24"/>
+          <w:szCs w:val="24"/>
+        </w:rPr>
         <w:t>Monolithic architecture</w:t>
       </w:r>
     </w:p>
@@ -214,19 +729,205 @@
           <w:ilvl w:val="0"/>
           <w:numId w:val="1"/>
         </w:numPr>
-      </w:pPr>
-      <w:r>
+        <w:rPr>
+          <w:rFonts w:ascii="Arial" w:eastAsia="Arial" w:hAnsi="Arial" w:cs="Arial"/>
+          <w:sz w:val="24"/>
+          <w:szCs w:val="24"/>
+        </w:rPr>
+      </w:pPr>
+      <w:r>
+        <w:rPr>
+          <w:rFonts w:ascii="Arial" w:eastAsia="Arial" w:hAnsi="Arial" w:cs="Arial"/>
+          <w:sz w:val="24"/>
+          <w:szCs w:val="24"/>
+        </w:rPr>
         <w:t>Class Diagram</w:t>
       </w:r>
     </w:p>
     <w:p>
-      <w:r>
+      <w:pPr>
+        <w:numPr>
+          <w:ilvl w:val="0"/>
+          <w:numId w:val="1"/>
+        </w:numPr>
+        <w:rPr>
+          <w:rFonts w:ascii="Arial" w:eastAsia="Arial" w:hAnsi="Arial" w:cs="Arial"/>
+          <w:sz w:val="24"/>
+          <w:szCs w:val="24"/>
+        </w:rPr>
+      </w:pPr>
+    </w:p>
+    <w:p>
+      <w:pPr>
+        <w:rPr>
+          <w:rFonts w:ascii="Arial" w:eastAsia="Arial" w:hAnsi="Arial" w:cs="Arial"/>
+          <w:sz w:val="24"/>
+          <w:szCs w:val="24"/>
+        </w:rPr>
+      </w:pPr>
+      <w:r>
+        <w:rPr>
+          <w:rFonts w:ascii="Arial" w:eastAsia="Arial" w:hAnsi="Arial" w:cs="Arial"/>
+          <w:sz w:val="24"/>
+          <w:szCs w:val="24"/>
+        </w:rPr>
         <w:t xml:space="preserve">List of class: </w:t>
       </w:r>
     </w:p>
     <w:p>
-      <w:r>
+      <w:pPr>
+        <w:rPr>
+          <w:rFonts w:ascii="Arial" w:eastAsia="Arial" w:hAnsi="Arial" w:cs="Arial"/>
+          <w:sz w:val="24"/>
+          <w:szCs w:val="24"/>
+        </w:rPr>
+      </w:pPr>
+      <w:r>
+        <w:rPr>
+          <w:rFonts w:ascii="Arial" w:eastAsia="Arial" w:hAnsi="Arial" w:cs="Arial"/>
+          <w:sz w:val="24"/>
+          <w:szCs w:val="24"/>
+        </w:rPr>
         <w:t xml:space="preserve">User: </w:t>
+      </w:r>
+    </w:p>
+    <w:p>
+      <w:pPr>
+        <w:rPr>
+          <w:rFonts w:ascii="Arial" w:eastAsia="Arial" w:hAnsi="Arial" w:cs="Arial"/>
+          <w:sz w:val="24"/>
+          <w:szCs w:val="24"/>
+        </w:rPr>
+      </w:pPr>
+      <w:r>
+        <w:rPr>
+          <w:rFonts w:ascii="Arial" w:eastAsia="Arial" w:hAnsi="Arial" w:cs="Arial"/>
+          <w:sz w:val="24"/>
+          <w:szCs w:val="24"/>
+        </w:rPr>
+        <w:br w:type="page"/>
+      </w:r>
+    </w:p>
+    <w:p>
+      <w:pPr>
+        <w:pStyle w:val="Heading3"/>
+        <w:shd w:val="clear" w:color="auto" w:fill="FFFFFF" w:themeFill="background1"/>
+        <w:spacing w:before="644" w:after="215"/>
+        <w:rPr>
+          <w:rFonts w:ascii="Arial" w:eastAsia="Arial" w:hAnsi="Arial" w:cs="Arial"/>
+          <w:b/>
+          <w:bCs/>
+          <w:color w:val="162521"/>
+          <w:sz w:val="24"/>
+          <w:szCs w:val="24"/>
+        </w:rPr>
+      </w:pPr>
+      <w:r>
+        <w:rPr>
+          <w:rFonts w:ascii="Arial" w:eastAsia="Arial" w:hAnsi="Arial" w:cs="Arial"/>
+          <w:b/>
+          <w:bCs/>
+          <w:color w:val="162521"/>
+          <w:sz w:val="24"/>
+          <w:szCs w:val="24"/>
+        </w:rPr>
+        <w:lastRenderedPageBreak/>
+        <w:t>Step 2: Selection of Technology Stack</w:t>
+      </w:r>
+    </w:p>
+    <w:p/>
+    <w:p>
+      <w:pPr>
+        <w:pStyle w:val="Heading3"/>
+        <w:shd w:val="clear" w:color="auto" w:fill="FFFFFF" w:themeFill="background1"/>
+        <w:spacing w:before="644" w:after="215"/>
+      </w:pPr>
+      <w:r>
+        <w:rPr>
+          <w:rFonts w:ascii="Playfair Display" w:eastAsia="Playfair Display" w:hAnsi="Playfair Display" w:cs="Playfair Display"/>
+          <w:b/>
+          <w:bCs/>
+          <w:color w:val="162521"/>
+          <w:sz w:val="22"/>
+          <w:szCs w:val="22"/>
+        </w:rPr>
+        <w:t>Step 3: Design the User Interface and User Experience (UI/UX)</w:t>
+      </w:r>
+    </w:p>
+    <w:p/>
+    <w:p>
+      <w:pPr>
+        <w:pStyle w:val="Heading3"/>
+        <w:shd w:val="clear" w:color="auto" w:fill="FFFFFF" w:themeFill="background1"/>
+        <w:spacing w:before="644" w:after="215"/>
+      </w:pPr>
+      <w:r>
+        <w:rPr>
+          <w:rFonts w:ascii="Playfair Display" w:eastAsia="Playfair Display" w:hAnsi="Playfair Display" w:cs="Playfair Display"/>
+          <w:b/>
+          <w:bCs/>
+          <w:color w:val="162521"/>
+          <w:sz w:val="22"/>
+          <w:szCs w:val="22"/>
+        </w:rPr>
+        <w:t>Step 4: Front-end Development</w:t>
+      </w:r>
+    </w:p>
+    <w:p/>
+    <w:p>
+      <w:pPr>
+        <w:pStyle w:val="Heading3"/>
+        <w:shd w:val="clear" w:color="auto" w:fill="FFFFFF" w:themeFill="background1"/>
+        <w:spacing w:before="644" w:after="215"/>
+      </w:pPr>
+      <w:r>
+        <w:rPr>
+          <w:rFonts w:ascii="Playfair Display" w:eastAsia="Playfair Display" w:hAnsi="Playfair Display" w:cs="Playfair Display"/>
+          <w:b/>
+          <w:bCs/>
+          <w:color w:val="162521"/>
+          <w:sz w:val="22"/>
+          <w:szCs w:val="22"/>
+        </w:rPr>
+        <w:t>Step 5: Back-end Development</w:t>
+      </w:r>
+    </w:p>
+    <w:p/>
+    <w:p>
+      <w:pPr>
+        <w:pStyle w:val="Heading3"/>
+        <w:shd w:val="clear" w:color="auto" w:fill="FFFFFF" w:themeFill="background1"/>
+        <w:spacing w:before="644" w:after="215"/>
+      </w:pPr>
+      <w:r>
+        <w:rPr>
+          <w:rFonts w:ascii="Playfair Display" w:eastAsia="Playfair Display" w:hAnsi="Playfair Display" w:cs="Playfair Display"/>
+          <w:b/>
+          <w:bCs/>
+          <w:color w:val="162521"/>
+          <w:sz w:val="22"/>
+          <w:szCs w:val="22"/>
+        </w:rPr>
+        <w:t>Step 6: Testing</w:t>
+      </w:r>
+    </w:p>
+    <w:p/>
+    <w:p>
+      <w:pPr>
+        <w:pStyle w:val="Heading3"/>
+        <w:shd w:val="clear" w:color="auto" w:fill="FFFFFF" w:themeFill="background1"/>
+        <w:spacing w:before="644" w:after="215"/>
+      </w:pPr>
+      <w:r>
+        <w:rPr>
+          <w:rFonts w:ascii="Playfair Display" w:eastAsia="Playfair Display" w:hAnsi="Playfair Display" w:cs="Playfair Display"/>
+          <w:b/>
+          <w:bCs/>
+          <w:color w:val="162521"/>
+          <w:sz w:val="22"/>
+          <w:szCs w:val="22"/>
+        </w:rPr>
+        <w:t>Step 7: Deployment and Maintenance</w:t>
       </w:r>
     </w:p>
     <w:p/>
@@ -237,6 +938,88 @@
     <w:p/>
     <w:p/>
     <w:p/>
+    <w:p/>
+    <w:p>
+      <w:pPr>
+        <w:rPr>
+          <w:rFonts w:ascii="Arial" w:eastAsia="Arial" w:hAnsi="Arial" w:cs="Arial"/>
+          <w:sz w:val="24"/>
+          <w:szCs w:val="24"/>
+        </w:rPr>
+      </w:pPr>
+    </w:p>
+    <w:p>
+      <w:pPr>
+        <w:rPr>
+          <w:rFonts w:ascii="Arial" w:eastAsia="Arial" w:hAnsi="Arial" w:cs="Arial"/>
+          <w:sz w:val="24"/>
+          <w:szCs w:val="24"/>
+        </w:rPr>
+      </w:pPr>
+    </w:p>
+    <w:p>
+      <w:pPr>
+        <w:rPr>
+          <w:rFonts w:ascii="Arial" w:eastAsia="Arial" w:hAnsi="Arial" w:cs="Arial"/>
+          <w:sz w:val="24"/>
+          <w:szCs w:val="24"/>
+        </w:rPr>
+      </w:pPr>
+    </w:p>
+    <w:p>
+      <w:pPr>
+        <w:rPr>
+          <w:rFonts w:ascii="Arial" w:eastAsia="Arial" w:hAnsi="Arial" w:cs="Arial"/>
+          <w:sz w:val="24"/>
+          <w:szCs w:val="24"/>
+        </w:rPr>
+      </w:pPr>
+    </w:p>
+    <w:p>
+      <w:pPr>
+        <w:rPr>
+          <w:rFonts w:ascii="Arial" w:eastAsia="Arial" w:hAnsi="Arial" w:cs="Arial"/>
+          <w:sz w:val="24"/>
+          <w:szCs w:val="24"/>
+        </w:rPr>
+      </w:pPr>
+    </w:p>
+    <w:p>
+      <w:pPr>
+        <w:rPr>
+          <w:rFonts w:ascii="Arial" w:eastAsia="Arial" w:hAnsi="Arial" w:cs="Arial"/>
+          <w:sz w:val="24"/>
+          <w:szCs w:val="24"/>
+        </w:rPr>
+      </w:pPr>
+    </w:p>
+    <w:p>
+      <w:pPr>
+        <w:rPr>
+          <w:rFonts w:ascii="Arial" w:eastAsia="Arial" w:hAnsi="Arial" w:cs="Arial"/>
+          <w:sz w:val="24"/>
+          <w:szCs w:val="24"/>
+        </w:rPr>
+      </w:pPr>
+    </w:p>
+    <w:p>
+      <w:pPr>
+        <w:rPr>
+          <w:rFonts w:ascii="Arial" w:eastAsia="Arial" w:hAnsi="Arial" w:cs="Arial"/>
+          <w:sz w:val="24"/>
+          <w:szCs w:val="24"/>
+        </w:rPr>
+      </w:pPr>
+    </w:p>
+    <w:p>
+      <w:pPr>
+        <w:rPr>
+          <w:rFonts w:ascii="Arial" w:eastAsia="Arial" w:hAnsi="Arial" w:cs="Arial"/>
+          <w:sz w:val="24"/>
+          <w:szCs w:val="24"/>
+        </w:rPr>
+      </w:pPr>
+    </w:p>
     <w:sectPr>
       <w:pgSz w:w="11906" w:h="16838" w:code="9"/>
       <w:pgMar w:top="720" w:right="720" w:bottom="720" w:left="720" w:header="720" w:footer="720" w:gutter="0"/>
@@ -250,6 +1033,119 @@
 <file path=word/numbering.xml><?xml version="1.0" encoding="utf-8"?>
 <w:numbering xmlns:wpc="http://schemas.microsoft.com/office/word/2010/wordprocessingCanvas" xmlns:cx="http://schemas.microsoft.com/office/drawing/2014/chartex" xmlns:cx1="http://schemas.microsoft.com/office/drawing/2015/9/8/chartex" xmlns:cx2="http://schemas.microsoft.com/office/drawing/2015/10/21/chartex" xmlns:cx3="http://schemas.microsoft.com/office/drawing/2016/5/9/chartex" xmlns:cx4="http://schemas.microsoft.com/office/drawing/2016/5/10/chartex" xmlns:cx5="http://schemas.microsoft.com/office/drawing/2016/5/11/chartex" xmlns:cx6="http://schemas.microsoft.com/office/drawing/2016/5/12/chartex" xmlns:cx7="http://schemas.microsoft.com/office/drawing/2016/5/13/chartex" xmlns:cx8="http://schemas.microsoft.com/office/drawing/2016/5/14/chartex" xmlns:mc="http://schemas.openxmlformats.org/markup-compatibility/2006" xmlns:aink="http://schemas.microsoft.com/office/drawing/2016/ink" xmlns:am3d="http://schemas.microsoft.com/office/drawing/2017/model3d" xmlns:o="urn:schemas-microsoft-com:office:office" xmlns:oel="http://schemas.microsoft.com/office/2019/extlst" xmlns:r="http://schemas.openxmlformats.org/officeDocument/2006/relationships" xmlns:m="http://schemas.openxmlformats.org/officeDocument/2006/math" xmlns:v="urn:schemas-microsoft-com:vml" xmlns:wp14="http://schemas.microsoft.com/office/word/2010/wordprocessingDrawing" xmlns:wp="http://schemas.openxmlformats.org/drawingml/2006/wordprocessingDrawing" xmlns:w10="urn:schemas-microsoft-com:office:word" xmlns:w="http://schemas.openxmlformats.org/wordprocessingml/2006/main" xmlns:w14="http://schemas.microsoft.com/office/word/2010/wordml" xmlns:w15="http://schemas.microsoft.com/office/word/2012/wordml" xmlns:w16cex="http://schemas.microsoft.com/office/word/2018/wordml/cex" xmlns:w16cid="http://schemas.microsoft.com/office/word/2016/wordml/cid" xmlns:w16="http://schemas.microsoft.com/office/word/2018/wordml" xmlns:w16du="http://schemas.microsoft.com/office/word/2023/wordml/word16du" xmlns:w16sdtdh="http://schemas.microsoft.com/office/word/2020/wordml/sdtdatahash" xmlns:w16se="http://schemas.microsoft.com/office/word/2015/wordml/symex" xmlns:wpg="http://schemas.microsoft.com/office/word/2010/wordprocessingGroup" xmlns:wpi="http://schemas.microsoft.com/office/word/2010/wordprocessingInk" xmlns:wne="http://schemas.microsoft.com/office/word/2006/wordml" xmlns:wps="http://schemas.microsoft.com/office/word/2010/wordprocessingShape" mc:Ignorable="w14 w15 w16se w16cid w16 w16cex w16sdtdh w16du wp14">
   <w:abstractNum w:abstractNumId="0" w15:restartNumberingAfterBreak="0">
+    <w:nsid w:val="1E2642D0"/>
+    <w:multiLevelType w:val="hybridMultilevel"/>
+    <w:tmpl w:val="C6CCF7F2"/>
+    <w:lvl w:ilvl="0" w:tplc="04090001">
+      <w:start w:val="1"/>
+      <w:numFmt w:val="bullet"/>
+      <w:lvlText w:val=""/>
+      <w:lvlJc w:val="left"/>
+      <w:pPr>
+        <w:ind w:left="720" w:hanging="360"/>
+      </w:pPr>
+      <w:rPr>
+        <w:rFonts w:ascii="Symbol" w:hAnsi="Symbol" w:hint="default"/>
+      </w:rPr>
+    </w:lvl>
+    <w:lvl w:ilvl="1" w:tplc="04090003" w:tentative="1">
+      <w:start w:val="1"/>
+      <w:numFmt w:val="bullet"/>
+      <w:lvlText w:val="o"/>
+      <w:lvlJc w:val="left"/>
+      <w:pPr>
+        <w:ind w:left="1440" w:hanging="360"/>
+      </w:pPr>
+      <w:rPr>
+        <w:rFonts w:ascii="Courier New" w:hAnsi="Courier New" w:cs="Courier New" w:hint="default"/>
+      </w:rPr>
+    </w:lvl>
+    <w:lvl w:ilvl="2" w:tplc="04090005" w:tentative="1">
+      <w:start w:val="1"/>
+      <w:numFmt w:val="bullet"/>
+      <w:lvlText w:val=""/>
+      <w:lvlJc w:val="left"/>
+      <w:pPr>
+        <w:ind w:left="2160" w:hanging="360"/>
+      </w:pPr>
+      <w:rPr>
+        <w:rFonts w:ascii="Wingdings" w:hAnsi="Wingdings" w:hint="default"/>
+      </w:rPr>
+    </w:lvl>
+    <w:lvl w:ilvl="3" w:tplc="04090001" w:tentative="1">
+      <w:start w:val="1"/>
+      <w:numFmt w:val="bullet"/>
+      <w:lvlText w:val=""/>
+      <w:lvlJc w:val="left"/>
+      <w:pPr>
+        <w:ind w:left="2880" w:hanging="360"/>
+      </w:pPr>
+      <w:rPr>
+        <w:rFonts w:ascii="Symbol" w:hAnsi="Symbol" w:hint="default"/>
+      </w:rPr>
+    </w:lvl>
+    <w:lvl w:ilvl="4" w:tplc="04090003" w:tentative="1">
+      <w:start w:val="1"/>
+      <w:numFmt w:val="bullet"/>
+      <w:lvlText w:val="o"/>
+      <w:lvlJc w:val="left"/>
+      <w:pPr>
+        <w:ind w:left="3600" w:hanging="360"/>
+      </w:pPr>
+      <w:rPr>
+        <w:rFonts w:ascii="Courier New" w:hAnsi="Courier New" w:cs="Courier New" w:hint="default"/>
+      </w:rPr>
+    </w:lvl>
+    <w:lvl w:ilvl="5" w:tplc="04090005" w:tentative="1">
+      <w:start w:val="1"/>
+      <w:numFmt w:val="bullet"/>
+      <w:lvlText w:val=""/>
+      <w:lvlJc w:val="left"/>
+      <w:pPr>
+        <w:ind w:left="4320" w:hanging="360"/>
+      </w:pPr>
+      <w:rPr>
+        <w:rFonts w:ascii="Wingdings" w:hAnsi="Wingdings" w:hint="default"/>
+      </w:rPr>
+    </w:lvl>
+    <w:lvl w:ilvl="6" w:tplc="04090001" w:tentative="1">
+      <w:start w:val="1"/>
+      <w:numFmt w:val="bullet"/>
+      <w:lvlText w:val=""/>
+      <w:lvlJc w:val="left"/>
+      <w:pPr>
+        <w:ind w:left="5040" w:hanging="360"/>
+      </w:pPr>
+      <w:rPr>
+        <w:rFonts w:ascii="Symbol" w:hAnsi="Symbol" w:hint="default"/>
+      </w:rPr>
+    </w:lvl>
+    <w:lvl w:ilvl="7" w:tplc="04090003" w:tentative="1">
+      <w:start w:val="1"/>
+      <w:numFmt w:val="bullet"/>
+      <w:lvlText w:val="o"/>
+      <w:lvlJc w:val="left"/>
+      <w:pPr>
+        <w:ind w:left="5760" w:hanging="360"/>
+      </w:pPr>
+      <w:rPr>
+        <w:rFonts w:ascii="Courier New" w:hAnsi="Courier New" w:cs="Courier New" w:hint="default"/>
+      </w:rPr>
+    </w:lvl>
+    <w:lvl w:ilvl="8" w:tplc="04090005" w:tentative="1">
+      <w:start w:val="1"/>
+      <w:numFmt w:val="bullet"/>
+      <w:lvlText w:val=""/>
+      <w:lvlJc w:val="left"/>
+      <w:pPr>
+        <w:ind w:left="6480" w:hanging="360"/>
+      </w:pPr>
+      <w:rPr>
+        <w:rFonts w:ascii="Wingdings" w:hAnsi="Wingdings" w:hint="default"/>
+      </w:rPr>
+    </w:lvl>
+  </w:abstractNum>
+  <w:abstractNum w:abstractNumId="1" w15:restartNumberingAfterBreak="0">
     <w:nsid w:val="24243AEC"/>
     <w:multiLevelType w:val="multilevel"/>
     <w:tmpl w:val="3BC2D5D2"/>
@@ -398,7 +1294,242 @@
       </w:rPr>
     </w:lvl>
   </w:abstractNum>
+  <w:abstractNum w:abstractNumId="2" w15:restartNumberingAfterBreak="0">
+    <w:nsid w:val="26262B0B"/>
+    <w:multiLevelType w:val="hybridMultilevel"/>
+    <w:tmpl w:val="13F053BE"/>
+    <w:lvl w:ilvl="0" w:tplc="04090001">
+      <w:start w:val="1"/>
+      <w:numFmt w:val="bullet"/>
+      <w:lvlText w:val=""/>
+      <w:lvlJc w:val="left"/>
+      <w:pPr>
+        <w:ind w:left="720" w:hanging="360"/>
+      </w:pPr>
+      <w:rPr>
+        <w:rFonts w:ascii="Symbol" w:hAnsi="Symbol" w:hint="default"/>
+      </w:rPr>
+    </w:lvl>
+    <w:lvl w:ilvl="1" w:tplc="04090003" w:tentative="1">
+      <w:start w:val="1"/>
+      <w:numFmt w:val="bullet"/>
+      <w:lvlText w:val="o"/>
+      <w:lvlJc w:val="left"/>
+      <w:pPr>
+        <w:ind w:left="1440" w:hanging="360"/>
+      </w:pPr>
+      <w:rPr>
+        <w:rFonts w:ascii="Courier New" w:hAnsi="Courier New" w:cs="Courier New" w:hint="default"/>
+      </w:rPr>
+    </w:lvl>
+    <w:lvl w:ilvl="2" w:tplc="04090005" w:tentative="1">
+      <w:start w:val="1"/>
+      <w:numFmt w:val="bullet"/>
+      <w:lvlText w:val=""/>
+      <w:lvlJc w:val="left"/>
+      <w:pPr>
+        <w:ind w:left="2160" w:hanging="360"/>
+      </w:pPr>
+      <w:rPr>
+        <w:rFonts w:ascii="Wingdings" w:hAnsi="Wingdings" w:hint="default"/>
+      </w:rPr>
+    </w:lvl>
+    <w:lvl w:ilvl="3" w:tplc="04090001" w:tentative="1">
+      <w:start w:val="1"/>
+      <w:numFmt w:val="bullet"/>
+      <w:lvlText w:val=""/>
+      <w:lvlJc w:val="left"/>
+      <w:pPr>
+        <w:ind w:left="2880" w:hanging="360"/>
+      </w:pPr>
+      <w:rPr>
+        <w:rFonts w:ascii="Symbol" w:hAnsi="Symbol" w:hint="default"/>
+      </w:rPr>
+    </w:lvl>
+    <w:lvl w:ilvl="4" w:tplc="04090003" w:tentative="1">
+      <w:start w:val="1"/>
+      <w:numFmt w:val="bullet"/>
+      <w:lvlText w:val="o"/>
+      <w:lvlJc w:val="left"/>
+      <w:pPr>
+        <w:ind w:left="3600" w:hanging="360"/>
+      </w:pPr>
+      <w:rPr>
+        <w:rFonts w:ascii="Courier New" w:hAnsi="Courier New" w:cs="Courier New" w:hint="default"/>
+      </w:rPr>
+    </w:lvl>
+    <w:lvl w:ilvl="5" w:tplc="04090005" w:tentative="1">
+      <w:start w:val="1"/>
+      <w:numFmt w:val="bullet"/>
+      <w:lvlText w:val=""/>
+      <w:lvlJc w:val="left"/>
+      <w:pPr>
+        <w:ind w:left="4320" w:hanging="360"/>
+      </w:pPr>
+      <w:rPr>
+        <w:rFonts w:ascii="Wingdings" w:hAnsi="Wingdings" w:hint="default"/>
+      </w:rPr>
+    </w:lvl>
+    <w:lvl w:ilvl="6" w:tplc="04090001" w:tentative="1">
+      <w:start w:val="1"/>
+      <w:numFmt w:val="bullet"/>
+      <w:lvlText w:val=""/>
+      <w:lvlJc w:val="left"/>
+      <w:pPr>
+        <w:ind w:left="5040" w:hanging="360"/>
+      </w:pPr>
+      <w:rPr>
+        <w:rFonts w:ascii="Symbol" w:hAnsi="Symbol" w:hint="default"/>
+      </w:rPr>
+    </w:lvl>
+    <w:lvl w:ilvl="7" w:tplc="04090003" w:tentative="1">
+      <w:start w:val="1"/>
+      <w:numFmt w:val="bullet"/>
+      <w:lvlText w:val="o"/>
+      <w:lvlJc w:val="left"/>
+      <w:pPr>
+        <w:ind w:left="5760" w:hanging="360"/>
+      </w:pPr>
+      <w:rPr>
+        <w:rFonts w:ascii="Courier New" w:hAnsi="Courier New" w:cs="Courier New" w:hint="default"/>
+      </w:rPr>
+    </w:lvl>
+    <w:lvl w:ilvl="8" w:tplc="04090005" w:tentative="1">
+      <w:start w:val="1"/>
+      <w:numFmt w:val="bullet"/>
+      <w:lvlText w:val=""/>
+      <w:lvlJc w:val="left"/>
+      <w:pPr>
+        <w:ind w:left="6480" w:hanging="360"/>
+      </w:pPr>
+      <w:rPr>
+        <w:rFonts w:ascii="Wingdings" w:hAnsi="Wingdings" w:hint="default"/>
+      </w:rPr>
+    </w:lvl>
+  </w:abstractNum>
+  <w:abstractNum w:abstractNumId="3" w15:restartNumberingAfterBreak="0">
+    <w:nsid w:val="7A6B2A96"/>
+    <w:multiLevelType w:val="hybridMultilevel"/>
+    <w:tmpl w:val="F47023FC"/>
+    <w:lvl w:ilvl="0" w:tplc="04090001">
+      <w:start w:val="1"/>
+      <w:numFmt w:val="bullet"/>
+      <w:lvlText w:val=""/>
+      <w:lvlJc w:val="left"/>
+      <w:pPr>
+        <w:ind w:left="720" w:hanging="360"/>
+      </w:pPr>
+      <w:rPr>
+        <w:rFonts w:ascii="Symbol" w:hAnsi="Symbol" w:hint="default"/>
+      </w:rPr>
+    </w:lvl>
+    <w:lvl w:ilvl="1" w:tplc="04090003" w:tentative="1">
+      <w:start w:val="1"/>
+      <w:numFmt w:val="bullet"/>
+      <w:lvlText w:val="o"/>
+      <w:lvlJc w:val="left"/>
+      <w:pPr>
+        <w:ind w:left="1440" w:hanging="360"/>
+      </w:pPr>
+      <w:rPr>
+        <w:rFonts w:ascii="Courier New" w:hAnsi="Courier New" w:cs="Courier New" w:hint="default"/>
+      </w:rPr>
+    </w:lvl>
+    <w:lvl w:ilvl="2" w:tplc="04090005" w:tentative="1">
+      <w:start w:val="1"/>
+      <w:numFmt w:val="bullet"/>
+      <w:lvlText w:val=""/>
+      <w:lvlJc w:val="left"/>
+      <w:pPr>
+        <w:ind w:left="2160" w:hanging="360"/>
+      </w:pPr>
+      <w:rPr>
+        <w:rFonts w:ascii="Wingdings" w:hAnsi="Wingdings" w:hint="default"/>
+      </w:rPr>
+    </w:lvl>
+    <w:lvl w:ilvl="3" w:tplc="04090001" w:tentative="1">
+      <w:start w:val="1"/>
+      <w:numFmt w:val="bullet"/>
+      <w:lvlText w:val=""/>
+      <w:lvlJc w:val="left"/>
+      <w:pPr>
+        <w:ind w:left="2880" w:hanging="360"/>
+      </w:pPr>
+      <w:rPr>
+        <w:rFonts w:ascii="Symbol" w:hAnsi="Symbol" w:hint="default"/>
+      </w:rPr>
+    </w:lvl>
+    <w:lvl w:ilvl="4" w:tplc="04090003" w:tentative="1">
+      <w:start w:val="1"/>
+      <w:numFmt w:val="bullet"/>
+      <w:lvlText w:val="o"/>
+      <w:lvlJc w:val="left"/>
+      <w:pPr>
+        <w:ind w:left="3600" w:hanging="360"/>
+      </w:pPr>
+      <w:rPr>
+        <w:rFonts w:ascii="Courier New" w:hAnsi="Courier New" w:cs="Courier New" w:hint="default"/>
+      </w:rPr>
+    </w:lvl>
+    <w:lvl w:ilvl="5" w:tplc="04090005" w:tentative="1">
+      <w:start w:val="1"/>
+      <w:numFmt w:val="bullet"/>
+      <w:lvlText w:val=""/>
+      <w:lvlJc w:val="left"/>
+      <w:pPr>
+        <w:ind w:left="4320" w:hanging="360"/>
+      </w:pPr>
+      <w:rPr>
+        <w:rFonts w:ascii="Wingdings" w:hAnsi="Wingdings" w:hint="default"/>
+      </w:rPr>
+    </w:lvl>
+    <w:lvl w:ilvl="6" w:tplc="04090001" w:tentative="1">
+      <w:start w:val="1"/>
+      <w:numFmt w:val="bullet"/>
+      <w:lvlText w:val=""/>
+      <w:lvlJc w:val="left"/>
+      <w:pPr>
+        <w:ind w:left="5040" w:hanging="360"/>
+      </w:pPr>
+      <w:rPr>
+        <w:rFonts w:ascii="Symbol" w:hAnsi="Symbol" w:hint="default"/>
+      </w:rPr>
+    </w:lvl>
+    <w:lvl w:ilvl="7" w:tplc="04090003" w:tentative="1">
+      <w:start w:val="1"/>
+      <w:numFmt w:val="bullet"/>
+      <w:lvlText w:val="o"/>
+      <w:lvlJc w:val="left"/>
+      <w:pPr>
+        <w:ind w:left="5760" w:hanging="360"/>
+      </w:pPr>
+      <w:rPr>
+        <w:rFonts w:ascii="Courier New" w:hAnsi="Courier New" w:cs="Courier New" w:hint="default"/>
+      </w:rPr>
+    </w:lvl>
+    <w:lvl w:ilvl="8" w:tplc="04090005" w:tentative="1">
+      <w:start w:val="1"/>
+      <w:numFmt w:val="bullet"/>
+      <w:lvlText w:val=""/>
+      <w:lvlJc w:val="left"/>
+      <w:pPr>
+        <w:ind w:left="6480" w:hanging="360"/>
+      </w:pPr>
+      <w:rPr>
+        <w:rFonts w:ascii="Wingdings" w:hAnsi="Wingdings" w:hint="default"/>
+      </w:rPr>
+    </w:lvl>
+  </w:abstractNum>
   <w:num w:numId="1" w16cid:durableId="1025135852">
+    <w:abstractNumId w:val="1"/>
+  </w:num>
+  <w:num w:numId="2" w16cid:durableId="825823557">
+    <w:abstractNumId w:val="2"/>
+  </w:num>
+  <w:num w:numId="3" w16cid:durableId="912814527">
+    <w:abstractNumId w:val="3"/>
+  </w:num>
+  <w:num w:numId="4" w16cid:durableId="139277222">
     <w:abstractNumId w:val="0"/>
   </w:num>
 </w:numbering>
@@ -1007,6 +2138,7 @@
   <w:style w:type="character" w:default="1" w:styleId="DefaultParagraphFont">
     <w:name w:val="Default Paragraph Font"/>
     <w:uiPriority w:val="1"/>
+    <w:semiHidden/>
     <w:unhideWhenUsed/>
   </w:style>
   <w:style w:type="table" w:default="1" w:styleId="TableNormal">

</xml_diff>